<commit_message>
Update PDF || Descargable
</commit_message>
<xml_diff>
--- a/fuentes/73310066_CF03_DU.docx
+++ b/fuentes/73310066_CF03_DU.docx
@@ -199,7 +199,7 @@
               </wp:anchor>
             </w:drawing>
           </mc:Choice>
-          <mc:Fallback xmlns:oel="http://schemas.microsoft.com/office/2019/extlst" xmlns:w16du="http://schemas.microsoft.com/office/word/2023/wordml/word16du">
+          <mc:Fallback xmlns:w16du="http://schemas.microsoft.com/office/word/2023/wordml/word16du" xmlns:oel="http://schemas.microsoft.com/office/2019/extlst">
             <w:pict>
               <v:rect w14:anchorId="04BF2410" id="Rectángulo 3" o:spid="_x0000_s1026" alt="&quot;&quot;" style="position:absolute;margin-left:-55.7pt;margin-top:26.5pt;width:613.85pt;height:204pt;z-index:-251655168;visibility:visible;mso-wrap-style:square;mso-height-percent:0;mso-wrap-distance-left:9pt;mso-wrap-distance-top:0;mso-wrap-distance-right:9pt;mso-wrap-distance-bottom:0;mso-position-horizontal:absolute;mso-position-horizontal-relative:text;mso-position-vertical:absolute;mso-position-vertical-relative:text;mso-height-percent:0;mso-height-relative:margin;v-text-anchor:middle" o:gfxdata="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" fillcolor="#00314d" stroked="f" strokeweight="1pt"/>
             </w:pict>
@@ -596,7 +596,7 @@
           <w:r>
             <w:fldChar w:fldCharType="separate"/>
           </w:r>
-          <w:hyperlink w:anchor="_Toc179300583" w:history="1">
+          <w:hyperlink w:anchor="_Toc179463979" w:history="1">
             <w:r>
               <w:rPr>
                 <w:rStyle w:val="Hipervnculo"/>
@@ -623,7 +623,7 @@
                 <w:noProof/>
                 <w:webHidden/>
               </w:rPr>
-              <w:instrText xml:space="preserve"> PAGEREF _Toc179300583 \h </w:instrText>
+              <w:instrText xml:space="preserve"> PAGEREF _Toc179463979 \h </w:instrText>
             </w:r>
             <w:r>
               <w:rPr>
@@ -670,7 +670,7 @@
               <w14:ligatures w14:val="none"/>
             </w:rPr>
           </w:pPr>
-          <w:hyperlink w:anchor="_Toc179300584" w:history="1">
+          <w:hyperlink w:anchor="_Toc179463980" w:history="1">
             <w:r>
               <w:rPr>
                 <w:rStyle w:val="Hipervnculo"/>
@@ -715,7 +715,7 @@
                 <w:noProof/>
                 <w:webHidden/>
               </w:rPr>
-              <w:instrText xml:space="preserve"> PAGEREF _Toc179300584 \h </w:instrText>
+              <w:instrText xml:space="preserve"> PAGEREF _Toc179463980 \h </w:instrText>
             </w:r>
             <w:r>
               <w:rPr>
@@ -762,7 +762,7 @@
               <w14:ligatures w14:val="none"/>
             </w:rPr>
           </w:pPr>
-          <w:hyperlink w:anchor="_Toc179300585" w:history="1">
+          <w:hyperlink w:anchor="_Toc179463981" w:history="1">
             <w:r>
               <w:rPr>
                 <w:rStyle w:val="Hipervnculo"/>
@@ -807,7 +807,7 @@
                 <w:noProof/>
                 <w:webHidden/>
               </w:rPr>
-              <w:instrText xml:space="preserve"> PAGEREF _Toc179300585 \h </w:instrText>
+              <w:instrText xml:space="preserve"> PAGEREF _Toc179463981 \h </w:instrText>
             </w:r>
             <w:r>
               <w:rPr>
@@ -853,7 +853,7 @@
               <w14:ligatures w14:val="none"/>
             </w:rPr>
           </w:pPr>
-          <w:hyperlink w:anchor="_Toc179300586" w:history="1">
+          <w:hyperlink w:anchor="_Toc179463982" w:history="1">
             <w:r>
               <w:rPr>
                 <w:rStyle w:val="Hipervnculo"/>
@@ -880,7 +880,7 @@
                 <w:noProof/>
                 <w:webHidden/>
               </w:rPr>
-              <w:instrText xml:space="preserve"> PAGEREF _Toc179300586 \h </w:instrText>
+              <w:instrText xml:space="preserve"> PAGEREF _Toc179463982 \h </w:instrText>
             </w:r>
             <w:r>
               <w:rPr>
@@ -927,7 +927,7 @@
               <w14:ligatures w14:val="none"/>
             </w:rPr>
           </w:pPr>
-          <w:hyperlink w:anchor="_Toc179300587" w:history="1">
+          <w:hyperlink w:anchor="_Toc179463983" w:history="1">
             <w:r>
               <w:rPr>
                 <w:rStyle w:val="Hipervnculo"/>
@@ -951,7 +951,21 @@
                 <w:rStyle w:val="Hipervnculo"/>
                 <w:noProof/>
               </w:rPr>
-              <w:t>Nutrición de cultivos</w:t>
+              <w:t xml:space="preserve">Nutrición de </w:t>
+            </w:r>
+            <w:r>
+              <w:rPr>
+                <w:rStyle w:val="Hipervnculo"/>
+                <w:noProof/>
+              </w:rPr>
+              <w:t>c</w:t>
+            </w:r>
+            <w:r>
+              <w:rPr>
+                <w:rStyle w:val="Hipervnculo"/>
+                <w:noProof/>
+              </w:rPr>
+              <w:t>ultivos</w:t>
             </w:r>
             <w:r>
               <w:rPr>
@@ -972,7 +986,7 @@
                 <w:noProof/>
                 <w:webHidden/>
               </w:rPr>
-              <w:instrText xml:space="preserve"> PAGEREF _Toc179300587 \h </w:instrText>
+              <w:instrText xml:space="preserve"> PAGEREF _Toc179463983 \h </w:instrText>
             </w:r>
             <w:r>
               <w:rPr>
@@ -992,7 +1006,7 @@
                 <w:noProof/>
                 <w:webHidden/>
               </w:rPr>
-              <w:t>9</w:t>
+              <w:t>8</w:t>
             </w:r>
             <w:r>
               <w:rPr>
@@ -1018,7 +1032,7 @@
               <w14:ligatures w14:val="none"/>
             </w:rPr>
           </w:pPr>
-          <w:hyperlink w:anchor="_Toc179300588" w:history="1">
+          <w:hyperlink w:anchor="_Toc179463984" w:history="1">
             <w:r>
               <w:rPr>
                 <w:rStyle w:val="Hipervnculo"/>
@@ -1045,7 +1059,7 @@
                 <w:noProof/>
                 <w:webHidden/>
               </w:rPr>
-              <w:instrText xml:space="preserve"> PAGEREF _Toc179300588 \h </w:instrText>
+              <w:instrText xml:space="preserve"> PAGEREF _Toc179463984 \h </w:instrText>
             </w:r>
             <w:r>
               <w:rPr>
@@ -1065,7 +1079,7 @@
                 <w:noProof/>
                 <w:webHidden/>
               </w:rPr>
-              <w:t>9</w:t>
+              <w:t>8</w:t>
             </w:r>
             <w:r>
               <w:rPr>
@@ -1092,7 +1106,7 @@
               <w14:ligatures w14:val="none"/>
             </w:rPr>
           </w:pPr>
-          <w:hyperlink w:anchor="_Toc179300589" w:history="1">
+          <w:hyperlink w:anchor="_Toc179463985" w:history="1">
             <w:r>
               <w:rPr>
                 <w:rStyle w:val="Hipervnculo"/>
@@ -1137,7 +1151,7 @@
                 <w:noProof/>
                 <w:webHidden/>
               </w:rPr>
-              <w:instrText xml:space="preserve"> PAGEREF _Toc179300589 \h </w:instrText>
+              <w:instrText xml:space="preserve"> PAGEREF _Toc179463985 \h </w:instrText>
             </w:r>
             <w:r>
               <w:rPr>
@@ -1157,7 +1171,7 @@
                 <w:noProof/>
                 <w:webHidden/>
               </w:rPr>
-              <w:t>11</w:t>
+              <w:t>10</w:t>
             </w:r>
             <w:r>
               <w:rPr>
@@ -1184,7 +1198,7 @@
               <w14:ligatures w14:val="none"/>
             </w:rPr>
           </w:pPr>
-          <w:hyperlink w:anchor="_Toc179300590" w:history="1">
+          <w:hyperlink w:anchor="_Toc179463986" w:history="1">
             <w:r>
               <w:rPr>
                 <w:rStyle w:val="Hipervnculo"/>
@@ -1229,7 +1243,7 @@
                 <w:noProof/>
                 <w:webHidden/>
               </w:rPr>
-              <w:instrText xml:space="preserve"> PAGEREF _Toc179300590 \h </w:instrText>
+              <w:instrText xml:space="preserve"> PAGEREF _Toc179463986 \h </w:instrText>
             </w:r>
             <w:r>
               <w:rPr>
@@ -1249,7 +1263,7 @@
                 <w:noProof/>
                 <w:webHidden/>
               </w:rPr>
-              <w:t>12</w:t>
+              <w:t>11</w:t>
             </w:r>
             <w:r>
               <w:rPr>
@@ -1276,7 +1290,7 @@
               <w14:ligatures w14:val="none"/>
             </w:rPr>
           </w:pPr>
-          <w:hyperlink w:anchor="_Toc179300591" w:history="1">
+          <w:hyperlink w:anchor="_Toc179463987" w:history="1">
             <w:r>
               <w:rPr>
                 <w:rStyle w:val="Hipervnculo"/>
@@ -1321,7 +1335,7 @@
                 <w:noProof/>
                 <w:webHidden/>
               </w:rPr>
-              <w:instrText xml:space="preserve"> PAGEREF _Toc179300591 \h </w:instrText>
+              <w:instrText xml:space="preserve"> PAGEREF _Toc179463987 \h </w:instrText>
             </w:r>
             <w:r>
               <w:rPr>
@@ -1341,7 +1355,7 @@
                 <w:noProof/>
                 <w:webHidden/>
               </w:rPr>
-              <w:t>15</w:t>
+              <w:t>13</w:t>
             </w:r>
             <w:r>
               <w:rPr>
@@ -1368,7 +1382,7 @@
               <w14:ligatures w14:val="none"/>
             </w:rPr>
           </w:pPr>
-          <w:hyperlink w:anchor="_Toc179300592" w:history="1">
+          <w:hyperlink w:anchor="_Toc179463988" w:history="1">
             <w:r>
               <w:rPr>
                 <w:rStyle w:val="Hipervnculo"/>
@@ -1413,7 +1427,7 @@
                 <w:noProof/>
                 <w:webHidden/>
               </w:rPr>
-              <w:instrText xml:space="preserve"> PAGEREF _Toc179300592 \h </w:instrText>
+              <w:instrText xml:space="preserve"> PAGEREF _Toc179463988 \h </w:instrText>
             </w:r>
             <w:r>
               <w:rPr>
@@ -1433,7 +1447,7 @@
                 <w:noProof/>
                 <w:webHidden/>
               </w:rPr>
-              <w:t>16</w:t>
+              <w:t>14</w:t>
             </w:r>
             <w:r>
               <w:rPr>
@@ -1460,7 +1474,7 @@
               <w14:ligatures w14:val="none"/>
             </w:rPr>
           </w:pPr>
-          <w:hyperlink w:anchor="_Toc179300593" w:history="1">
+          <w:hyperlink w:anchor="_Toc179463989" w:history="1">
             <w:r>
               <w:rPr>
                 <w:rStyle w:val="Hipervnculo"/>
@@ -1505,7 +1519,7 @@
                 <w:noProof/>
                 <w:webHidden/>
               </w:rPr>
-              <w:instrText xml:space="preserve"> PAGEREF _Toc179300593 \h </w:instrText>
+              <w:instrText xml:space="preserve"> PAGEREF _Toc179463989 \h </w:instrText>
             </w:r>
             <w:r>
               <w:rPr>
@@ -1525,7 +1539,7 @@
                 <w:noProof/>
                 <w:webHidden/>
               </w:rPr>
-              <w:t>17</w:t>
+              <w:t>16</w:t>
             </w:r>
             <w:r>
               <w:rPr>
@@ -1552,7 +1566,7 @@
               <w14:ligatures w14:val="none"/>
             </w:rPr>
           </w:pPr>
-          <w:hyperlink w:anchor="_Toc179300594" w:history="1">
+          <w:hyperlink w:anchor="_Toc179463990" w:history="1">
             <w:r>
               <w:rPr>
                 <w:rStyle w:val="Hipervnculo"/>
@@ -1597,7 +1611,7 @@
                 <w:noProof/>
                 <w:webHidden/>
               </w:rPr>
-              <w:instrText xml:space="preserve"> PAGEREF _Toc179300594 \h </w:instrText>
+              <w:instrText xml:space="preserve"> PAGEREF _Toc179463990 \h </w:instrText>
             </w:r>
             <w:r>
               <w:rPr>
@@ -1617,7 +1631,7 @@
                 <w:noProof/>
                 <w:webHidden/>
               </w:rPr>
-              <w:t>17</w:t>
+              <w:t>16</w:t>
             </w:r>
             <w:r>
               <w:rPr>
@@ -1643,7 +1657,7 @@
               <w14:ligatures w14:val="none"/>
             </w:rPr>
           </w:pPr>
-          <w:hyperlink w:anchor="_Toc179300595" w:history="1">
+          <w:hyperlink w:anchor="_Toc179463991" w:history="1">
             <w:r>
               <w:rPr>
                 <w:rStyle w:val="Hipervnculo"/>
@@ -1670,7 +1684,7 @@
                 <w:noProof/>
                 <w:webHidden/>
               </w:rPr>
-              <w:instrText xml:space="preserve"> PAGEREF _Toc179300595 \h </w:instrText>
+              <w:instrText xml:space="preserve"> PAGEREF _Toc179463991 \h </w:instrText>
             </w:r>
             <w:r>
               <w:rPr>
@@ -1690,7 +1704,7 @@
                 <w:noProof/>
                 <w:webHidden/>
               </w:rPr>
-              <w:t>17</w:t>
+              <w:t>16</w:t>
             </w:r>
             <w:r>
               <w:rPr>
@@ -1716,7 +1730,7 @@
               <w14:ligatures w14:val="none"/>
             </w:rPr>
           </w:pPr>
-          <w:hyperlink w:anchor="_Toc179300596" w:history="1">
+          <w:hyperlink w:anchor="_Toc179463992" w:history="1">
             <w:r>
               <w:rPr>
                 <w:rStyle w:val="Hipervnculo"/>
@@ -1743,7 +1757,7 @@
                 <w:noProof/>
                 <w:webHidden/>
               </w:rPr>
-              <w:instrText xml:space="preserve"> PAGEREF _Toc179300596 \h </w:instrText>
+              <w:instrText xml:space="preserve"> PAGEREF _Toc179463992 \h </w:instrText>
             </w:r>
             <w:r>
               <w:rPr>
@@ -1763,7 +1777,7 @@
                 <w:noProof/>
                 <w:webHidden/>
               </w:rPr>
-              <w:t>17</w:t>
+              <w:t>16</w:t>
             </w:r>
             <w:r>
               <w:rPr>
@@ -1790,7 +1804,7 @@
               <w14:ligatures w14:val="none"/>
             </w:rPr>
           </w:pPr>
-          <w:hyperlink w:anchor="_Toc179300597" w:history="1">
+          <w:hyperlink w:anchor="_Toc179463993" w:history="1">
             <w:r>
               <w:rPr>
                 <w:rStyle w:val="Hipervnculo"/>
@@ -1814,7 +1828,21 @@
                 <w:rStyle w:val="Hipervnculo"/>
                 <w:noProof/>
               </w:rPr>
-              <w:t>Lombricompuesto</w:t>
+              <w:t>Lom</w:t>
+            </w:r>
+            <w:r>
+              <w:rPr>
+                <w:rStyle w:val="Hipervnculo"/>
+                <w:noProof/>
+              </w:rPr>
+              <w:t>b</w:t>
+            </w:r>
+            <w:r>
+              <w:rPr>
+                <w:rStyle w:val="Hipervnculo"/>
+                <w:noProof/>
+              </w:rPr>
+              <w:t>ricompuesto</w:t>
             </w:r>
             <w:r>
               <w:rPr>
@@ -1835,7 +1863,7 @@
                 <w:noProof/>
                 <w:webHidden/>
               </w:rPr>
-              <w:instrText xml:space="preserve"> PAGEREF _Toc179300597 \h </w:instrText>
+              <w:instrText xml:space="preserve"> PAGEREF _Toc179463993 \h </w:instrText>
             </w:r>
             <w:r>
               <w:rPr>
@@ -1855,7 +1883,7 @@
                 <w:noProof/>
                 <w:webHidden/>
               </w:rPr>
-              <w:t>19</w:t>
+              <w:t>18</w:t>
             </w:r>
             <w:r>
               <w:rPr>
@@ -1881,7 +1909,7 @@
               <w14:ligatures w14:val="none"/>
             </w:rPr>
           </w:pPr>
-          <w:hyperlink w:anchor="_Toc179300598" w:history="1">
+          <w:hyperlink w:anchor="_Toc179463994" w:history="1">
             <w:r>
               <w:rPr>
                 <w:rStyle w:val="Hipervnculo"/>
@@ -1908,7 +1936,7 @@
                 <w:noProof/>
                 <w:webHidden/>
               </w:rPr>
-              <w:instrText xml:space="preserve"> PAGEREF _Toc179300598 \h </w:instrText>
+              <w:instrText xml:space="preserve"> PAGEREF _Toc179463994 \h </w:instrText>
             </w:r>
             <w:r>
               <w:rPr>
@@ -1928,7 +1956,7 @@
                 <w:noProof/>
                 <w:webHidden/>
               </w:rPr>
-              <w:t>19</w:t>
+              <w:t>18</w:t>
             </w:r>
             <w:r>
               <w:rPr>
@@ -1954,7 +1982,7 @@
               <w14:ligatures w14:val="none"/>
             </w:rPr>
           </w:pPr>
-          <w:hyperlink w:anchor="_Toc179300599" w:history="1">
+          <w:hyperlink w:anchor="_Toc179463995" w:history="1">
             <w:r>
               <w:rPr>
                 <w:rStyle w:val="Hipervnculo"/>
@@ -1981,7 +2009,7 @@
                 <w:noProof/>
                 <w:webHidden/>
               </w:rPr>
-              <w:instrText xml:space="preserve"> PAGEREF _Toc179300599 \h </w:instrText>
+              <w:instrText xml:space="preserve"> PAGEREF _Toc179463995 \h </w:instrText>
             </w:r>
             <w:r>
               <w:rPr>
@@ -2001,7 +2029,7 @@
                 <w:noProof/>
                 <w:webHidden/>
               </w:rPr>
-              <w:t>19</w:t>
+              <w:t>18</w:t>
             </w:r>
             <w:r>
               <w:rPr>
@@ -2028,7 +2056,7 @@
               <w14:ligatures w14:val="none"/>
             </w:rPr>
           </w:pPr>
-          <w:hyperlink w:anchor="_Toc179300600" w:history="1">
+          <w:hyperlink w:anchor="_Toc179463996" w:history="1">
             <w:r>
               <w:rPr>
                 <w:rStyle w:val="Hipervnculo"/>
@@ -2073,7 +2101,7 @@
                 <w:noProof/>
                 <w:webHidden/>
               </w:rPr>
-              <w:instrText xml:space="preserve"> PAGEREF _Toc179300600 \h </w:instrText>
+              <w:instrText xml:space="preserve"> PAGEREF _Toc179463996 \h </w:instrText>
             </w:r>
             <w:r>
               <w:rPr>
@@ -2093,7 +2121,7 @@
                 <w:noProof/>
                 <w:webHidden/>
               </w:rPr>
-              <w:t>21</w:t>
+              <w:t>20</w:t>
             </w:r>
             <w:r>
               <w:rPr>
@@ -2119,7 +2147,7 @@
               <w14:ligatures w14:val="none"/>
             </w:rPr>
           </w:pPr>
-          <w:hyperlink w:anchor="_Toc179300601" w:history="1">
+          <w:hyperlink w:anchor="_Toc179463997" w:history="1">
             <w:r>
               <w:rPr>
                 <w:rStyle w:val="Hipervnculo"/>
@@ -2146,7 +2174,7 @@
                 <w:noProof/>
                 <w:webHidden/>
               </w:rPr>
-              <w:instrText xml:space="preserve"> PAGEREF _Toc179300601 \h </w:instrText>
+              <w:instrText xml:space="preserve"> PAGEREF _Toc179463997 \h </w:instrText>
             </w:r>
             <w:r>
               <w:rPr>
@@ -2166,7 +2194,7 @@
                 <w:noProof/>
                 <w:webHidden/>
               </w:rPr>
-              <w:t>21</w:t>
+              <w:t>20</w:t>
             </w:r>
             <w:r>
               <w:rPr>
@@ -2192,7 +2220,7 @@
               <w14:ligatures w14:val="none"/>
             </w:rPr>
           </w:pPr>
-          <w:hyperlink w:anchor="_Toc179300602" w:history="1">
+          <w:hyperlink w:anchor="_Toc179463998" w:history="1">
             <w:r>
               <w:rPr>
                 <w:rStyle w:val="Hipervnculo"/>
@@ -2219,7 +2247,7 @@
                 <w:noProof/>
                 <w:webHidden/>
               </w:rPr>
-              <w:instrText xml:space="preserve"> PAGEREF _Toc179300602 \h </w:instrText>
+              <w:instrText xml:space="preserve"> PAGEREF _Toc179463998 \h </w:instrText>
             </w:r>
             <w:r>
               <w:rPr>
@@ -2239,7 +2267,7 @@
                 <w:noProof/>
                 <w:webHidden/>
               </w:rPr>
-              <w:t>21</w:t>
+              <w:t>20</w:t>
             </w:r>
             <w:r>
               <w:rPr>
@@ -2265,7 +2293,7 @@
               <w14:ligatures w14:val="none"/>
             </w:rPr>
           </w:pPr>
-          <w:hyperlink w:anchor="_Toc179300603" w:history="1">
+          <w:hyperlink w:anchor="_Toc179463999" w:history="1">
             <w:r>
               <w:rPr>
                 <w:rStyle w:val="Hipervnculo"/>
@@ -2292,7 +2320,7 @@
                 <w:noProof/>
                 <w:webHidden/>
               </w:rPr>
-              <w:instrText xml:space="preserve"> PAGEREF _Toc179300603 \h </w:instrText>
+              <w:instrText xml:space="preserve"> PAGEREF _Toc179463999 \h </w:instrText>
             </w:r>
             <w:r>
               <w:rPr>
@@ -2312,7 +2340,7 @@
                 <w:noProof/>
                 <w:webHidden/>
               </w:rPr>
-              <w:t>22</w:t>
+              <w:t>21</w:t>
             </w:r>
             <w:r>
               <w:rPr>
@@ -2339,7 +2367,7 @@
               <w14:ligatures w14:val="none"/>
             </w:rPr>
           </w:pPr>
-          <w:hyperlink w:anchor="_Toc179300604" w:history="1">
+          <w:hyperlink w:anchor="_Toc179464000" w:history="1">
             <w:r>
               <w:rPr>
                 <w:rStyle w:val="Hipervnculo"/>
@@ -2384,7 +2412,7 @@
                 <w:noProof/>
                 <w:webHidden/>
               </w:rPr>
-              <w:instrText xml:space="preserve"> PAGEREF _Toc179300604 \h </w:instrText>
+              <w:instrText xml:space="preserve"> PAGEREF _Toc179464000 \h </w:instrText>
             </w:r>
             <w:r>
               <w:rPr>
@@ -2404,7 +2432,7 @@
                 <w:noProof/>
                 <w:webHidden/>
               </w:rPr>
-              <w:t>23</w:t>
+              <w:t>22</w:t>
             </w:r>
             <w:r>
               <w:rPr>
@@ -2430,7 +2458,7 @@
               <w14:ligatures w14:val="none"/>
             </w:rPr>
           </w:pPr>
-          <w:hyperlink w:anchor="_Toc179300605" w:history="1">
+          <w:hyperlink w:anchor="_Toc179464001" w:history="1">
             <w:r>
               <w:rPr>
                 <w:rStyle w:val="Hipervnculo"/>
@@ -2457,7 +2485,7 @@
                 <w:noProof/>
                 <w:webHidden/>
               </w:rPr>
-              <w:instrText xml:space="preserve"> PAGEREF _Toc179300605 \h </w:instrText>
+              <w:instrText xml:space="preserve"> PAGEREF _Toc179464001 \h </w:instrText>
             </w:r>
             <w:r>
               <w:rPr>
@@ -2477,7 +2505,7 @@
                 <w:noProof/>
                 <w:webHidden/>
               </w:rPr>
-              <w:t>24</w:t>
+              <w:t>23</w:t>
             </w:r>
             <w:r>
               <w:rPr>
@@ -2503,7 +2531,7 @@
               <w14:ligatures w14:val="none"/>
             </w:rPr>
           </w:pPr>
-          <w:hyperlink w:anchor="_Toc179300606" w:history="1">
+          <w:hyperlink w:anchor="_Toc179464002" w:history="1">
             <w:r>
               <w:rPr>
                 <w:rStyle w:val="Hipervnculo"/>
@@ -2530,7 +2558,7 @@
                 <w:noProof/>
                 <w:webHidden/>
               </w:rPr>
-              <w:instrText xml:space="preserve"> PAGEREF _Toc179300606 \h </w:instrText>
+              <w:instrText xml:space="preserve"> PAGEREF _Toc179464002 \h </w:instrText>
             </w:r>
             <w:r>
               <w:rPr>
@@ -2550,7 +2578,7 @@
                 <w:noProof/>
                 <w:webHidden/>
               </w:rPr>
-              <w:t>24</w:t>
+              <w:t>23</w:t>
             </w:r>
             <w:r>
               <w:rPr>
@@ -2576,7 +2604,7 @@
               <w14:ligatures w14:val="none"/>
             </w:rPr>
           </w:pPr>
-          <w:hyperlink w:anchor="_Toc179300607" w:history="1">
+          <w:hyperlink w:anchor="_Toc179464003" w:history="1">
             <w:r>
               <w:rPr>
                 <w:rStyle w:val="Hipervnculo"/>
@@ -2603,7 +2631,7 @@
                 <w:noProof/>
                 <w:webHidden/>
               </w:rPr>
-              <w:instrText xml:space="preserve"> PAGEREF _Toc179300607 \h </w:instrText>
+              <w:instrText xml:space="preserve"> PAGEREF _Toc179464003 \h </w:instrText>
             </w:r>
             <w:r>
               <w:rPr>
@@ -2623,7 +2651,7 @@
                 <w:noProof/>
                 <w:webHidden/>
               </w:rPr>
-              <w:t>25</w:t>
+              <w:t>24</w:t>
             </w:r>
             <w:r>
               <w:rPr>
@@ -2649,7 +2677,7 @@
               <w14:ligatures w14:val="none"/>
             </w:rPr>
           </w:pPr>
-          <w:hyperlink w:anchor="_Toc179300608" w:history="1">
+          <w:hyperlink w:anchor="_Toc179464004" w:history="1">
             <w:r>
               <w:rPr>
                 <w:rStyle w:val="Hipervnculo"/>
@@ -2676,7 +2704,7 @@
                 <w:noProof/>
                 <w:webHidden/>
               </w:rPr>
-              <w:instrText xml:space="preserve"> PAGEREF _Toc179300608 \h </w:instrText>
+              <w:instrText xml:space="preserve"> PAGEREF _Toc179464004 \h </w:instrText>
             </w:r>
             <w:r>
               <w:rPr>
@@ -2696,7 +2724,7 @@
                 <w:noProof/>
                 <w:webHidden/>
               </w:rPr>
-              <w:t>26</w:t>
+              <w:t>25</w:t>
             </w:r>
             <w:r>
               <w:rPr>
@@ -2722,7 +2750,7 @@
               <w14:ligatures w14:val="none"/>
             </w:rPr>
           </w:pPr>
-          <w:hyperlink w:anchor="_Toc179300609" w:history="1">
+          <w:hyperlink w:anchor="_Toc179464005" w:history="1">
             <w:r>
               <w:rPr>
                 <w:rStyle w:val="Hipervnculo"/>
@@ -2749,7 +2777,7 @@
                 <w:noProof/>
                 <w:webHidden/>
               </w:rPr>
-              <w:instrText xml:space="preserve"> PAGEREF _Toc179300609 \h </w:instrText>
+              <w:instrText xml:space="preserve"> PAGEREF _Toc179464005 \h </w:instrText>
             </w:r>
             <w:r>
               <w:rPr>
@@ -2769,7 +2797,7 @@
                 <w:noProof/>
                 <w:webHidden/>
               </w:rPr>
-              <w:t>27</w:t>
+              <w:t>26</w:t>
             </w:r>
             <w:r>
               <w:rPr>
@@ -2795,7 +2823,7 @@
               <w14:ligatures w14:val="none"/>
             </w:rPr>
           </w:pPr>
-          <w:hyperlink w:anchor="_Toc179300610" w:history="1">
+          <w:hyperlink w:anchor="_Toc179464006" w:history="1">
             <w:r>
               <w:rPr>
                 <w:rStyle w:val="Hipervnculo"/>
@@ -2822,7 +2850,7 @@
                 <w:noProof/>
                 <w:webHidden/>
               </w:rPr>
-              <w:instrText xml:space="preserve"> PAGEREF _Toc179300610 \h </w:instrText>
+              <w:instrText xml:space="preserve"> PAGEREF _Toc179464006 \h </w:instrText>
             </w:r>
             <w:r>
               <w:rPr>
@@ -2842,7 +2870,7 @@
                 <w:noProof/>
                 <w:webHidden/>
               </w:rPr>
-              <w:t>28</w:t>
+              <w:t>27</w:t>
             </w:r>
             <w:r>
               <w:rPr>
@@ -2868,7 +2896,7 @@
               <w14:ligatures w14:val="none"/>
             </w:rPr>
           </w:pPr>
-          <w:hyperlink w:anchor="_Toc179300611" w:history="1">
+          <w:hyperlink w:anchor="_Toc179464007" w:history="1">
             <w:r>
               <w:rPr>
                 <w:rStyle w:val="Hipervnculo"/>
@@ -2895,7 +2923,7 @@
                 <w:noProof/>
                 <w:webHidden/>
               </w:rPr>
-              <w:instrText xml:space="preserve"> PAGEREF _Toc179300611 \h </w:instrText>
+              <w:instrText xml:space="preserve"> PAGEREF _Toc179464007 \h </w:instrText>
             </w:r>
             <w:r>
               <w:rPr>
@@ -2915,7 +2943,7 @@
                 <w:noProof/>
                 <w:webHidden/>
               </w:rPr>
-              <w:t>30</w:t>
+              <w:t>29</w:t>
             </w:r>
             <w:r>
               <w:rPr>
@@ -2941,7 +2969,7 @@
               <w14:ligatures w14:val="none"/>
             </w:rPr>
           </w:pPr>
-          <w:hyperlink w:anchor="_Toc179300612" w:history="1">
+          <w:hyperlink w:anchor="_Toc179464008" w:history="1">
             <w:r>
               <w:rPr>
                 <w:rStyle w:val="Hipervnculo"/>
@@ -2968,7 +2996,80 @@
                 <w:noProof/>
                 <w:webHidden/>
               </w:rPr>
-              <w:instrText xml:space="preserve"> PAGEREF _Toc179300612 \h </w:instrText>
+              <w:instrText xml:space="preserve"> PAGEREF _Toc179464008 \h </w:instrText>
+            </w:r>
+            <w:r>
+              <w:rPr>
+                <w:noProof/>
+                <w:webHidden/>
+              </w:rPr>
+            </w:r>
+            <w:r>
+              <w:rPr>
+                <w:noProof/>
+                <w:webHidden/>
+              </w:rPr>
+              <w:fldChar w:fldCharType="separate"/>
+            </w:r>
+            <w:r>
+              <w:rPr>
+                <w:noProof/>
+                <w:webHidden/>
+              </w:rPr>
+              <w:t>31</w:t>
+            </w:r>
+            <w:r>
+              <w:rPr>
+                <w:noProof/>
+                <w:webHidden/>
+              </w:rPr>
+              <w:fldChar w:fldCharType="end"/>
+            </w:r>
+          </w:hyperlink>
+        </w:p>
+        <w:p>
+          <w:pPr>
+            <w:pStyle w:val="TDC1"/>
+            <w:tabs>
+              <w:tab w:val="right" w:leader="dot" w:pos="9962"/>
+            </w:tabs>
+            <w:rPr>
+              <w:rFonts w:eastAsiaTheme="minorEastAsia"/>
+              <w:noProof/>
+              <w:kern w:val="0"/>
+              <w:sz w:val="22"/>
+              <w:lang w:eastAsia="es-CO"/>
+              <w14:ligatures w14:val="none"/>
+            </w:rPr>
+          </w:pPr>
+          <w:hyperlink w:anchor="_Toc179464009" w:history="1">
+            <w:r>
+              <w:rPr>
+                <w:rStyle w:val="Hipervnculo"/>
+                <w:noProof/>
+              </w:rPr>
+              <w:t>Créditos</w:t>
+            </w:r>
+            <w:r>
+              <w:rPr>
+                <w:noProof/>
+                <w:webHidden/>
+              </w:rPr>
+              <w:tab/>
+            </w:r>
+            <w:r>
+              <w:rPr>
+                <w:noProof/>
+                <w:webHidden/>
+              </w:rPr>
+              <w:fldChar w:fldCharType="begin"/>
+            </w:r>
+            <w:r>
+              <w:rPr>
+                <w:noProof/>
+                <w:webHidden/>
+              </w:rPr>
+              <w:instrText xml:space="preserve"> PAGEREF _Toc179464009 \h </w:instrText>
             </w:r>
             <w:r>
               <w:rPr>
@@ -3006,63 +3107,6 @@
               <w:tab w:val="right" w:leader="dot" w:pos="9962"/>
             </w:tabs>
           </w:pPr>
-          <w:hyperlink w:anchor="_Toc179300613" w:history="1">
-            <w:r>
-              <w:rPr>
-                <w:rStyle w:val="Hipervnculo"/>
-                <w:noProof/>
-              </w:rPr>
-              <w:t>Créditos</w:t>
-            </w:r>
-            <w:r>
-              <w:rPr>
-                <w:noProof/>
-                <w:webHidden/>
-              </w:rPr>
-              <w:tab/>
-            </w:r>
-            <w:r>
-              <w:rPr>
-                <w:noProof/>
-                <w:webHidden/>
-              </w:rPr>
-              <w:fldChar w:fldCharType="begin"/>
-            </w:r>
-            <w:r>
-              <w:rPr>
-                <w:noProof/>
-                <w:webHidden/>
-              </w:rPr>
-              <w:instrText xml:space="preserve"> PAGEREF _Toc179300613 \h </w:instrText>
-            </w:r>
-            <w:r>
-              <w:rPr>
-                <w:noProof/>
-                <w:webHidden/>
-              </w:rPr>
-            </w:r>
-            <w:r>
-              <w:rPr>
-                <w:noProof/>
-                <w:webHidden/>
-              </w:rPr>
-              <w:fldChar w:fldCharType="separate"/>
-            </w:r>
-            <w:r>
-              <w:rPr>
-                <w:noProof/>
-                <w:webHidden/>
-              </w:rPr>
-              <w:t>33</w:t>
-            </w:r>
-            <w:r>
-              <w:rPr>
-                <w:noProof/>
-                <w:webHidden/>
-              </w:rPr>
-              <w:fldChar w:fldCharType="end"/>
-            </w:r>
-          </w:hyperlink>
           <w:r>
             <w:rPr>
               <w:b/>
@@ -3089,7 +3133,7 @@
       <w:pPr>
         <w:pStyle w:val="Titulosgenerales"/>
       </w:pPr>
-      <w:bookmarkStart w:id="0" w:name="_Toc179300583"/>
+      <w:bookmarkStart w:id="0" w:name="_Toc179463979"/>
       <w:r>
         <w:lastRenderedPageBreak/>
         <w:t>Introducción</w:t>
@@ -3150,7 +3194,7 @@
       <w:pPr>
         <w:pStyle w:val="Ttulo1"/>
       </w:pPr>
-      <w:bookmarkStart w:id="1" w:name="_Toc179300584"/>
+      <w:bookmarkStart w:id="1" w:name="_Toc179463980"/>
       <w:r>
         <w:lastRenderedPageBreak/>
         <w:t>Conceptos básicos</w:t>
@@ -3511,7 +3555,7 @@
       <w:pPr>
         <w:pStyle w:val="Ttulo1"/>
       </w:pPr>
-      <w:bookmarkStart w:id="2" w:name="_Toc179300585"/>
+      <w:bookmarkStart w:id="2" w:name="_Toc179463981"/>
       <w:r>
         <w:lastRenderedPageBreak/>
         <w:t>El suelo como organismo vivo</w:t>
@@ -3694,7 +3738,7 @@
       <w:pPr>
         <w:pStyle w:val="Ttulo3"/>
       </w:pPr>
-      <w:bookmarkStart w:id="3" w:name="_Toc179300586"/>
+      <w:bookmarkStart w:id="3" w:name="_Toc179463982"/>
       <w:r>
         <w:t>Deficiencias nutricionales de los cultivos</w:t>
       </w:r>
@@ -4365,13 +4409,6 @@
           <w:lang w:val="es-419" w:eastAsia="es-CO"/>
         </w:rPr>
       </w:pPr>
-    </w:p>
-    <w:p>
-      <w:pPr>
-        <w:rPr>
-          <w:lang w:val="es-419" w:eastAsia="es-CO"/>
-        </w:rPr>
-      </w:pPr>
       <w:r>
         <w:rPr>
           <w:lang w:val="es-419" w:eastAsia="es-CO"/>
@@ -4389,20 +4426,26 @@
         <w:rPr>
           <w:lang w:val="es-419" w:eastAsia="es-CO"/>
         </w:rPr>
+        <w:t>¡</w:t>
+      </w:r>
+      <w:r>
+        <w:rPr>
+          <w:lang w:val="es-419" w:eastAsia="es-CO"/>
+        </w:rPr>
+        <w:t>U</w:t>
+      </w:r>
+      <w:r>
+        <w:rPr>
+          <w:lang w:val="es-419" w:eastAsia="es-CO"/>
+        </w:rPr>
+        <w:t xml:space="preserve">y no! Necesita hacerle un diagnóstico al suelo para que no pierda la cosecha, le podemos conseguir un kit de reactivos químicos para analizar el suelo, de esos que </w:t>
+      </w:r>
+      <w:r>
+        <w:rPr>
+          <w:lang w:val="es-419" w:eastAsia="es-CO"/>
+        </w:rPr>
         <w:lastRenderedPageBreak/>
-        <w:t>¡</w:t>
-      </w:r>
-      <w:r>
-        <w:rPr>
-          <w:lang w:val="es-419" w:eastAsia="es-CO"/>
-        </w:rPr>
-        <w:t>U</w:t>
-      </w:r>
-      <w:r>
-        <w:rPr>
-          <w:lang w:val="es-419" w:eastAsia="es-CO"/>
-        </w:rPr>
-        <w:t>y no! Necesita hacerle un diagnóstico al suelo para que no pierda la cosecha, le podemos conseguir un kit de reactivos químicos para analizar el suelo, de esos que venden en la cooperativa. Con unos tubitos y unos líquidos de colores, eso nos confirma s</w:t>
+        <w:t>venden en la cooperativa. Con unos tubitos y unos líquidos de colores, eso nos confirma s</w:t>
       </w:r>
       <w:r>
         <w:rPr>
@@ -4506,20 +4549,21 @@
         <w:rPr>
           <w:lang w:val="es-419" w:eastAsia="es-CO"/>
         </w:rPr>
-        <w:t xml:space="preserve">Porque mantener un suelo vivo y saludable es fundamental para la agricultura ecológica, usando métodos naturales como el compost, los abonos verdes y el monitoreo constante, los agricultores pueden obtener cosechas abundantes y sanas sin necesidad de químicos sintéticos. </w:t>
-      </w:r>
-    </w:p>
-    <w:p>
-      <w:pPr>
-        <w:rPr>
-          <w:lang w:val="es-419" w:eastAsia="es-CO"/>
-        </w:rPr>
-      </w:pPr>
-      <w:r>
-        <w:rPr>
-          <w:lang w:val="es-419" w:eastAsia="es-CO"/>
-        </w:rPr>
-        <w:lastRenderedPageBreak/>
+        <w:t>Porque mantener un suelo vivo y saludable es fundamental para la agricultura ecológica, usando métodos naturales como el compost, los abonos verdes y el monitoreo constante, los agricultores pueden obtener cosechas abundantes y sanas sin necesidad de químicos sintéticos.</w:t>
+      </w:r>
+    </w:p>
+    <w:p>
+      <w:pPr>
+        <w:spacing w:before="0" w:after="160" w:line="259" w:lineRule="auto"/>
+        <w:ind w:firstLine="0"/>
+        <w:rPr>
+          <w:lang w:val="es-419" w:eastAsia="es-CO"/>
+        </w:rPr>
+      </w:pPr>
+      <w:r>
+        <w:rPr>
+          <w:lang w:val="es-419" w:eastAsia="es-CO"/>
+        </w:rPr>
         <w:br w:type="page"/>
       </w:r>
     </w:p>
@@ -4527,7 +4571,7 @@
       <w:pPr>
         <w:pStyle w:val="Ttulo1"/>
       </w:pPr>
-      <w:bookmarkStart w:id="4" w:name="_Toc179300587"/>
+      <w:bookmarkStart w:id="4" w:name="_Toc179463983"/>
       <w:r>
         <w:lastRenderedPageBreak/>
         <w:t>Nutrición de cultivos</w:t>
@@ -4860,7 +4904,7 @@
       <w:pPr>
         <w:pStyle w:val="Ttulo3"/>
       </w:pPr>
-      <w:bookmarkStart w:id="5" w:name="_Toc179300588"/>
+      <w:bookmarkStart w:id="5" w:name="_Toc179463984"/>
       <w:r>
         <w:t>Prácticas de fertilización agroecológica</w:t>
       </w:r>
@@ -4967,7 +5011,7 @@
       <w:pPr>
         <w:pStyle w:val="Ttulo2"/>
       </w:pPr>
-      <w:bookmarkStart w:id="6" w:name="_Toc179300589"/>
+      <w:bookmarkStart w:id="6" w:name="_Toc179463985"/>
       <w:r>
         <w:t>Incorporación de materia orgánica</w:t>
       </w:r>
@@ -4978,7 +5022,6 @@
         <w:t>La materia orgánica es una fuente natural de nutrientes para las plantas, provenientes de su adecuada descomposición. Se origina en los residuos tanto animales como vegetales que tienen una descomposición natural, propiciada por los organismos del suelo, como las lombrices y los microorganismos (bacterias).</w:t>
       </w:r>
     </w:p>
-    <w:p/>
     <w:p>
       <w:pPr>
         <w:pStyle w:val="Prrafodelista"/>
@@ -5011,6 +5054,12 @@
     <w:p>
       <w:pPr>
         <w:pStyle w:val="Prrafodelista"/>
+        <w:ind w:left="1429" w:firstLine="0"/>
+      </w:pPr>
+    </w:p>
+    <w:p>
+      <w:pPr>
+        <w:pStyle w:val="Prrafodelista"/>
         <w:numPr>
           <w:ilvl w:val="0"/>
           <w:numId w:val="37"/>
@@ -5137,7 +5186,7 @@
       <w:pPr>
         <w:pStyle w:val="Ttulo2"/>
       </w:pPr>
-      <w:bookmarkStart w:id="7" w:name="_Toc179300590"/>
+      <w:bookmarkStart w:id="7" w:name="_Toc179463986"/>
       <w:r>
         <w:t>Abonos verdes</w:t>
       </w:r>
@@ -5180,18 +5229,6 @@
     <w:p>
       <w:pPr>
         <w:pStyle w:val="Prrafodelista"/>
-        <w:ind w:left="1429" w:firstLine="0"/>
-      </w:pPr>
-    </w:p>
-    <w:p>
-      <w:pPr>
-        <w:pStyle w:val="Prrafodelista"/>
-        <w:ind w:left="1429" w:firstLine="0"/>
-      </w:pPr>
-    </w:p>
-    <w:p>
-      <w:pPr>
-        <w:pStyle w:val="Prrafodelista"/>
         <w:numPr>
           <w:ilvl w:val="0"/>
           <w:numId w:val="37"/>
@@ -5215,28 +5252,28 @@
         <w:ind w:left="1429" w:firstLine="0"/>
       </w:pPr>
       <w:r>
+        <w:t xml:space="preserve">Las leguminosas presentan una simbiosis con bacterias nitrificantes, como la </w:t>
+      </w:r>
+      <w:proofErr w:type="spellStart"/>
+      <w:r>
+        <w:t>Rhizobium</w:t>
+      </w:r>
+      <w:proofErr w:type="spellEnd"/>
+      <w:r>
+        <w:t xml:space="preserve"> </w:t>
+      </w:r>
+      <w:proofErr w:type="spellStart"/>
+      <w:r>
+        <w:t>sp</w:t>
+      </w:r>
+      <w:proofErr w:type="spellEnd"/>
+      <w:r>
+        <w:t>., que convierten el nitrógeno atmosférico en formas disponibles para la nutrición de las plantas.</w:t>
+      </w:r>
+    </w:p>
+    <w:p>
+      <w:r>
         <w:lastRenderedPageBreak/>
-        <w:t xml:space="preserve">Las leguminosas presentan una simbiosis con bacterias nitrificantes, como la </w:t>
-      </w:r>
-      <w:proofErr w:type="spellStart"/>
-      <w:r>
-        <w:t>Rhizobium</w:t>
-      </w:r>
-      <w:proofErr w:type="spellEnd"/>
-      <w:r>
-        <w:t xml:space="preserve"> </w:t>
-      </w:r>
-      <w:proofErr w:type="spellStart"/>
-      <w:r>
-        <w:t>sp</w:t>
-      </w:r>
-      <w:proofErr w:type="spellEnd"/>
-      <w:r>
-        <w:t>., que convierten el nitrógeno atmosférico en formas disponibles para la nutrición de las plantas.</w:t>
-      </w:r>
-    </w:p>
-    <w:p>
-      <w:r>
         <w:t xml:space="preserve">Acompañen a Don Campos, </w:t>
       </w:r>
       <w:proofErr w:type="spellStart"/>
@@ -5372,53 +5409,53 @@
         </w:numPr>
       </w:pPr>
       <w:r>
+        <w:t xml:space="preserve">también pueden usar 1 litro de E.M. (que son microorganismos eficientes) en lugar de la levadura y la leche. </w:t>
+      </w:r>
+    </w:p>
+    <w:p>
+      <w:r>
+        <w:t xml:space="preserve">Ay Don Campos, cuéntenos cómo se prepara el </w:t>
+      </w:r>
+      <w:proofErr w:type="spellStart"/>
+      <w:r>
+        <w:t>biol</w:t>
+      </w:r>
+      <w:proofErr w:type="spellEnd"/>
+      <w:r>
+        <w:t xml:space="preserve"> básico. </w:t>
+      </w:r>
+    </w:p>
+    <w:p>
+      <w:r>
         <w:lastRenderedPageBreak/>
-        <w:t xml:space="preserve">también pueden usar 1 litro de E.M. (que son microorganismos eficientes) en lugar de la levadura y la leche. </w:t>
-      </w:r>
-    </w:p>
-    <w:p>
-      <w:r>
-        <w:t xml:space="preserve">Ay Don Campos, cuéntenos cómo se prepara el </w:t>
+        <w:t xml:space="preserve">¡Uy como ordene!... Primero, llenamos un tercio de la caneca con estiércol o mantillo de bosque. Ya saben, esa tierra negrita y suelta que está debajo de las hojas en el monte. Luego la llenamos de agua hasta dos tercios de la caneca. Después, agregamos la melaza, la cal y la leche (o el EM si decidieron usarlo). Revolvemos todo bien, como si fuera una sopa. </w:t>
+      </w:r>
+    </w:p>
+    <w:p>
+      <w:r>
+        <w:t xml:space="preserve">Cada 8 días le echamos un kilo más de melaza, para que los microrganismos que hacen la magia sigan contentos. </w:t>
+      </w:r>
+    </w:p>
+    <w:p>
+      <w:r>
+        <w:t xml:space="preserve">Y ojo con esto: hay que revolverlo todos los días. Es como estar pendiente de la olla de los tamales para que no se pasen de cocción. </w:t>
+      </w:r>
+    </w:p>
+    <w:p>
+      <w:r>
+        <w:t xml:space="preserve">Y después de 4 semanas... </w:t>
+      </w:r>
+    </w:p>
+    <w:p>
+      <w:r>
+        <w:t xml:space="preserve">¡listo el pollo!... </w:t>
       </w:r>
       <w:proofErr w:type="spellStart"/>
       <w:r>
-        <w:t>biol</w:t>
+        <w:t>eehh</w:t>
       </w:r>
       <w:proofErr w:type="spellEnd"/>
       <w:r>
-        <w:t xml:space="preserve"> básico. </w:t>
-      </w:r>
-    </w:p>
-    <w:p>
-      <w:r>
-        <w:t xml:space="preserve">¡Uy como ordene!... Primero, llenamos un tercio de la caneca con estiércol o mantillo de bosque. Ya saben, esa tierra negrita y suelta que está debajo de las hojas en el monte. Luego la llenamos de agua hasta dos tercios de la caneca. Después, agregamos la melaza, la cal y la leche (o el EM si decidieron usarlo). Revolvemos todo bien, como si fuera una sopa. </w:t>
-      </w:r>
-    </w:p>
-    <w:p>
-      <w:r>
-        <w:t xml:space="preserve">Cada 8 días le echamos un kilo más de melaza, para que los microrganismos que hacen la magia sigan contentos. </w:t>
-      </w:r>
-    </w:p>
-    <w:p>
-      <w:r>
-        <w:t xml:space="preserve">Y ojo con esto: hay que revolverlo todos los días. Es como estar pendiente de la olla de los tamales para que no se pasen de cocción. </w:t>
-      </w:r>
-    </w:p>
-    <w:p>
-      <w:r>
-        <w:t xml:space="preserve">Y después de 4 semanas... </w:t>
-      </w:r>
-    </w:p>
-    <w:p>
-      <w:r>
-        <w:t xml:space="preserve">¡listo el pollo!... </w:t>
-      </w:r>
-      <w:proofErr w:type="spellStart"/>
-      <w:r>
-        <w:t>eehh</w:t>
-      </w:r>
-      <w:proofErr w:type="spellEnd"/>
-      <w:r>
         <w:t xml:space="preserve">, perdón... el abono jeje. </w:t>
       </w:r>
     </w:p>
@@ -5442,9 +5479,8 @@
       <w:pPr>
         <w:pStyle w:val="Ttulo2"/>
       </w:pPr>
-      <w:bookmarkStart w:id="8" w:name="_Toc179300591"/>
-      <w:r>
-        <w:lastRenderedPageBreak/>
+      <w:bookmarkStart w:id="8" w:name="_Toc179463987"/>
+      <w:r>
         <w:t>Compostaje</w:t>
       </w:r>
       <w:bookmarkEnd w:id="8"/>
@@ -5454,6 +5490,7 @@
         <w:t>El compostaje es la práctica agroecológica que consiste en la descomposición controlada de residuos vegetales y/o animales, para obtener un material fuente de nutrientes disponible para las plantas.</w:t>
       </w:r>
     </w:p>
+    <w:p/>
     <w:p>
       <w:pPr>
         <w:pStyle w:val="Prrafodelista"/>
@@ -5471,6 +5508,7 @@
           <w:b/>
           <w:bCs/>
         </w:rPr>
+        <w:lastRenderedPageBreak/>
         <w:t>Disponibilidad de nutrientes</w:t>
       </w:r>
     </w:p>
@@ -5664,39 +5702,42 @@
     </w:p>
     <w:p>
       <w:r>
+        <w:t xml:space="preserve">Los compostajes más conocidos son: </w:t>
+      </w:r>
+      <w:proofErr w:type="spellStart"/>
+      <w:r>
+        <w:t>bocashi</w:t>
+      </w:r>
+      <w:proofErr w:type="spellEnd"/>
+      <w:r>
+        <w:t xml:space="preserve">, compost de pila y </w:t>
+      </w:r>
+      <w:proofErr w:type="spellStart"/>
+      <w:r>
+        <w:t>lombricompuesto</w:t>
+      </w:r>
+      <w:proofErr w:type="spellEnd"/>
+      <w:r>
+        <w:t>.</w:t>
+      </w:r>
+    </w:p>
+    <w:p>
+      <w:pPr>
+        <w:pStyle w:val="Ttulo2"/>
+      </w:pPr>
+      <w:bookmarkStart w:id="9" w:name="_Toc179463988"/>
+      <w:r>
+        <w:t>Abonos líquidos</w:t>
+      </w:r>
+      <w:bookmarkEnd w:id="9"/>
+    </w:p>
+    <w:p>
+      <w:r>
+        <w:t xml:space="preserve">Como su nombre lo indica, son abonos cuya preparación se realiza en agua y su aplicación a los suelos se hace en forma líquida. Se obtienen de la combinación de </w:t>
+      </w:r>
+      <w:r>
         <w:lastRenderedPageBreak/>
-        <w:t xml:space="preserve">Los compostajes más conocidos son: </w:t>
-      </w:r>
-      <w:proofErr w:type="spellStart"/>
-      <w:r>
-        <w:t>bocashi</w:t>
-      </w:r>
-      <w:proofErr w:type="spellEnd"/>
-      <w:r>
-        <w:t xml:space="preserve">, compost de pila y </w:t>
-      </w:r>
-      <w:proofErr w:type="spellStart"/>
-      <w:r>
-        <w:t>lombricompuesto</w:t>
-      </w:r>
-      <w:proofErr w:type="spellEnd"/>
-      <w:r>
-        <w:t>.</w:t>
-      </w:r>
-    </w:p>
-    <w:p>
-      <w:pPr>
-        <w:pStyle w:val="Ttulo2"/>
-      </w:pPr>
-      <w:bookmarkStart w:id="9" w:name="_Toc179300592"/>
-      <w:r>
-        <w:t>Abonos líquidos</w:t>
-      </w:r>
-      <w:bookmarkEnd w:id="9"/>
-    </w:p>
-    <w:p>
-      <w:r>
-        <w:t>Como su nombre lo indica, son abonos cuya preparación se realiza en agua y su aplicación a los suelos se hace en forma líquida. Se obtienen de la combinación de materia orgánica y otros componentes aceleradores de su descomposición que se mezclan para proporcionar una fuente de nutrientes orgánicos para los cultivos.</w:t>
+        <w:t>materia orgánica y otros componentes aceleradores de su descomposición que se mezclan para proporcionar una fuente de nutrientes orgánicos para los cultivos.</w:t>
       </w:r>
     </w:p>
     <w:p>
@@ -5725,7 +5766,7 @@
       <w:pPr>
         <w:pStyle w:val="Ttulo1"/>
       </w:pPr>
-      <w:bookmarkStart w:id="10" w:name="_Toc179300593"/>
+      <w:bookmarkStart w:id="10" w:name="_Toc179463989"/>
       <w:r>
         <w:lastRenderedPageBreak/>
         <w:t>Procedimiento para obtener abonos orgánicos</w:t>
@@ -5762,7 +5803,7 @@
       <w:pPr>
         <w:pStyle w:val="Ttulo2"/>
       </w:pPr>
-      <w:bookmarkStart w:id="11" w:name="_Toc179300594"/>
+      <w:bookmarkStart w:id="11" w:name="_Toc179463990"/>
       <w:r>
         <w:t>Compost de pila</w:t>
       </w:r>
@@ -5785,7 +5826,7 @@
       <w:pPr>
         <w:pStyle w:val="Ttulo3"/>
       </w:pPr>
-      <w:bookmarkStart w:id="12" w:name="_Toc179300595"/>
+      <w:bookmarkStart w:id="12" w:name="_Toc179463991"/>
       <w:r>
         <w:t>Insumos requeridos</w:t>
       </w:r>
@@ -5880,7 +5921,7 @@
       <w:pPr>
         <w:pStyle w:val="Ttulo3"/>
       </w:pPr>
-      <w:bookmarkStart w:id="13" w:name="_Toc179300596"/>
+      <w:bookmarkStart w:id="13" w:name="_Toc179463992"/>
       <w:r>
         <w:t>Procedimiento</w:t>
       </w:r>
@@ -6295,7 +6336,7 @@
       <w:pPr>
         <w:pStyle w:val="Ttulo2"/>
       </w:pPr>
-      <w:bookmarkStart w:id="14" w:name="_Toc179300597"/>
+      <w:bookmarkStart w:id="14" w:name="_Toc179463993"/>
       <w:proofErr w:type="spellStart"/>
       <w:r>
         <w:t>Lombricompuesto</w:t>
@@ -6348,7 +6389,7 @@
       <w:pPr>
         <w:pStyle w:val="Ttulo3"/>
       </w:pPr>
-      <w:bookmarkStart w:id="15" w:name="_Toc179300598"/>
+      <w:bookmarkStart w:id="15" w:name="_Toc179463994"/>
       <w:r>
         <w:t>Insumos requeridos</w:t>
       </w:r>
@@ -6407,7 +6448,7 @@
       <w:pPr>
         <w:pStyle w:val="Ttulo3"/>
       </w:pPr>
-      <w:bookmarkStart w:id="16" w:name="_Toc179300599"/>
+      <w:bookmarkStart w:id="16" w:name="_Toc179463995"/>
       <w:r>
         <w:t>Procedimiento</w:t>
       </w:r>
@@ -6935,7 +6976,7 @@
       <w:pPr>
         <w:pStyle w:val="Ttulo2"/>
       </w:pPr>
-      <w:bookmarkStart w:id="17" w:name="_Toc179300600"/>
+      <w:bookmarkStart w:id="17" w:name="_Toc179463996"/>
       <w:proofErr w:type="spellStart"/>
       <w:r>
         <w:t>Biol</w:t>
@@ -6977,7 +7018,7 @@
       <w:pPr>
         <w:pStyle w:val="Ttulo3"/>
       </w:pPr>
-      <w:bookmarkStart w:id="18" w:name="_Toc179300601"/>
+      <w:bookmarkStart w:id="18" w:name="_Toc179463997"/>
       <w:r>
         <w:t>Insumos requeridos</w:t>
       </w:r>
@@ -7103,7 +7144,7 @@
       <w:pPr>
         <w:pStyle w:val="Ttulo3"/>
       </w:pPr>
-      <w:bookmarkStart w:id="19" w:name="_Toc179300602"/>
+      <w:bookmarkStart w:id="19" w:name="_Toc179463998"/>
       <w:r>
         <w:t>Procedimiento</w:t>
       </w:r>
@@ -7386,7 +7427,7 @@
       <w:pPr>
         <w:pStyle w:val="Ttulo3"/>
       </w:pPr>
-      <w:bookmarkStart w:id="20" w:name="_Toc179300603"/>
+      <w:bookmarkStart w:id="20" w:name="_Toc179463999"/>
       <w:r>
         <w:t>Uso</w:t>
       </w:r>
@@ -7658,7 +7699,7 @@
       <w:pPr>
         <w:pStyle w:val="Ttulo2"/>
       </w:pPr>
-      <w:bookmarkStart w:id="21" w:name="_Toc179300604"/>
+      <w:bookmarkStart w:id="21" w:name="_Toc179464000"/>
       <w:r>
         <w:t>Abono orgánico fermentado tipo “</w:t>
       </w:r>
@@ -7724,7 +7765,7 @@
       <w:pPr>
         <w:pStyle w:val="Ttulo3"/>
       </w:pPr>
-      <w:bookmarkStart w:id="22" w:name="_Toc179300605"/>
+      <w:bookmarkStart w:id="22" w:name="_Toc179464001"/>
       <w:r>
         <w:lastRenderedPageBreak/>
         <w:t>Insumos requeridos</w:t>
@@ -7910,7 +7951,7 @@
       <w:pPr>
         <w:pStyle w:val="Ttulo3"/>
       </w:pPr>
-      <w:bookmarkStart w:id="23" w:name="_Toc179300606"/>
+      <w:bookmarkStart w:id="23" w:name="_Toc179464002"/>
       <w:r>
         <w:t>Procedimiento</w:t>
       </w:r>
@@ -8060,7 +8101,7 @@
       <w:pPr>
         <w:pStyle w:val="Ttulo3"/>
       </w:pPr>
-      <w:bookmarkStart w:id="24" w:name="_Toc179300607"/>
+      <w:bookmarkStart w:id="24" w:name="_Toc179464003"/>
       <w:r>
         <w:t>Uso y almacenamiento</w:t>
       </w:r>
@@ -8368,7 +8409,7 @@
       <w:pPr>
         <w:pStyle w:val="Ttulo3"/>
       </w:pPr>
-      <w:bookmarkStart w:id="25" w:name="_Toc179300608"/>
+      <w:bookmarkStart w:id="25" w:name="_Toc179464004"/>
       <w:r>
         <w:t>Precauciones</w:t>
       </w:r>
@@ -8541,7 +8582,7 @@
       <w:pPr>
         <w:pStyle w:val="Titulosgenerales"/>
       </w:pPr>
-      <w:bookmarkStart w:id="26" w:name="_Toc179300609"/>
+      <w:bookmarkStart w:id="26" w:name="_Toc179464005"/>
       <w:r>
         <w:lastRenderedPageBreak/>
         <w:t>Síntesis</w:t>
@@ -8630,7 +8671,7 @@
       <w:pPr>
         <w:pStyle w:val="Titulosgenerales"/>
       </w:pPr>
-      <w:bookmarkStart w:id="27" w:name="_Toc179300610"/>
+      <w:bookmarkStart w:id="27" w:name="_Toc179464006"/>
       <w:r>
         <w:lastRenderedPageBreak/>
         <w:t>Material complementario</w:t>
@@ -9287,19 +9328,7 @@
                 <w:rPr>
                   <w:rStyle w:val="Hipervnculo"/>
                 </w:rPr>
-                <w:t>https://www.youtube.com/watch?v=OvnDm7</w:t>
-              </w:r>
-              <w:r>
-                <w:rPr>
-                  <w:rStyle w:val="Hipervnculo"/>
-                </w:rPr>
-                <w:t>J</w:t>
-              </w:r>
-              <w:r>
-                <w:rPr>
-                  <w:rStyle w:val="Hipervnculo"/>
-                </w:rPr>
-                <w:t>Zz2E</w:t>
+                <w:t>https://www.youtube.com/watch?v=OvnDm7JZz2E</w:t>
               </w:r>
             </w:hyperlink>
           </w:p>
@@ -9374,19 +9403,7 @@
                 <w:rPr>
                   <w:rStyle w:val="Hipervnculo"/>
                 </w:rPr>
-                <w:t>https://www.youtube.com/watch?v</w:t>
-              </w:r>
-              <w:r>
-                <w:rPr>
-                  <w:rStyle w:val="Hipervnculo"/>
-                </w:rPr>
-                <w:t>=</w:t>
-              </w:r>
-              <w:r>
-                <w:rPr>
-                  <w:rStyle w:val="Hipervnculo"/>
-                </w:rPr>
-                <w:t>ht5k0A5Q2oE</w:t>
+                <w:t>https://www.youtube.com/watch?v=ht5k0A5Q2oE</w:t>
               </w:r>
             </w:hyperlink>
           </w:p>
@@ -9498,19 +9515,7 @@
                 <w:rPr>
                   <w:rStyle w:val="Hipervnculo"/>
                 </w:rPr>
-                <w:t>https://www.youtub</w:t>
-              </w:r>
-              <w:r>
-                <w:rPr>
-                  <w:rStyle w:val="Hipervnculo"/>
-                </w:rPr>
-                <w:t>e</w:t>
-              </w:r>
-              <w:r>
-                <w:rPr>
-                  <w:rStyle w:val="Hipervnculo"/>
-                </w:rPr>
-                <w:t>.com/watch?v=x1JNdLiUlIs</w:t>
+                <w:t>https://www.youtube.com/watch?v=x1JNdLiUlIs</w:t>
               </w:r>
             </w:hyperlink>
           </w:p>
@@ -9521,7 +9526,7 @@
       <w:pPr>
         <w:pStyle w:val="Titulosgenerales"/>
       </w:pPr>
-      <w:bookmarkStart w:id="28" w:name="_Toc179300611"/>
+      <w:bookmarkStart w:id="28" w:name="_Toc179464007"/>
       <w:r>
         <w:lastRenderedPageBreak/>
         <w:t>Glosario</w:t>
@@ -9747,7 +9752,7 @@
       <w:pPr>
         <w:pStyle w:val="Titulosgenerales"/>
       </w:pPr>
-      <w:bookmarkStart w:id="29" w:name="_Toc179300612"/>
+      <w:bookmarkStart w:id="29" w:name="_Toc179464008"/>
       <w:r>
         <w:lastRenderedPageBreak/>
         <w:t>Referencias bibliográficas</w:t>
@@ -9834,21 +9839,7 @@
             <w:rStyle w:val="Hipervnculo"/>
             <w:lang w:val="es-419" w:eastAsia="es-CO"/>
           </w:rPr>
-          <w:t>http://academic.uprm.edu/mmonroig/id25.h</w:t>
-        </w:r>
-        <w:r>
-          <w:rPr>
-            <w:rStyle w:val="Hipervnculo"/>
-            <w:lang w:val="es-419" w:eastAsia="es-CO"/>
-          </w:rPr>
-          <w:t>t</w:t>
-        </w:r>
-        <w:r>
-          <w:rPr>
-            <w:rStyle w:val="Hipervnculo"/>
-            <w:lang w:val="es-419" w:eastAsia="es-CO"/>
-          </w:rPr>
-          <w:t>m</w:t>
+          <w:t>http://academic.uprm.edu/mmonroig/id25.htm</w:t>
         </w:r>
       </w:hyperlink>
     </w:p>
@@ -9903,21 +9894,7 @@
             <w:rStyle w:val="Hipervnculo"/>
             <w:lang w:val="es-419" w:eastAsia="es-CO"/>
           </w:rPr>
-          <w:t>http://www</w:t>
-        </w:r>
-        <w:r>
-          <w:rPr>
-            <w:rStyle w:val="Hipervnculo"/>
-            <w:lang w:val="es-419" w:eastAsia="es-CO"/>
-          </w:rPr>
-          <w:t>.</w:t>
-        </w:r>
-        <w:r>
-          <w:rPr>
-            <w:rStyle w:val="Hipervnculo"/>
-            <w:lang w:val="es-419" w:eastAsia="es-CO"/>
-          </w:rPr>
-          <w:t>fao.org/3/a-i6041s.pdf</w:t>
+          <w:t>http://www.fao.org/3/a-i6041s.pdf</w:t>
         </w:r>
       </w:hyperlink>
       <w:r>
@@ -9931,7 +9908,7 @@
       <w:pPr>
         <w:pStyle w:val="Titulosgenerales"/>
       </w:pPr>
-      <w:bookmarkStart w:id="30" w:name="_Toc179300613"/>
+      <w:bookmarkStart w:id="30" w:name="_Toc179464009"/>
       <w:r>
         <w:lastRenderedPageBreak/>
         <w:t>Créditos</w:t>
@@ -18318,13 +18295,13 @@
 </file>
 
 <file path=customXml/itemProps2.xml><?xml version="1.0" encoding="utf-8"?>
-<ds:datastoreItem xmlns:ds="http://schemas.openxmlformats.org/officeDocument/2006/customXml" ds:itemID="{DA56113E-DE4F-4ABB-95AA-2F7C447BECFC}"/>
+<ds:datastoreItem xmlns:ds="http://schemas.openxmlformats.org/officeDocument/2006/customXml" ds:itemID="{2E398005-BD2F-42BA-B939-0BD6F0A706C3}"/>
 </file>
 
 <file path=customXml/itemProps3.xml><?xml version="1.0" encoding="utf-8"?>
-<ds:datastoreItem xmlns:ds="http://schemas.openxmlformats.org/officeDocument/2006/customXml" ds:itemID="{F8BB238B-1064-420B-8416-5A5DFF4B57BC}"/>
+<ds:datastoreItem xmlns:ds="http://schemas.openxmlformats.org/officeDocument/2006/customXml" ds:itemID="{C85B2378-EDF5-431C-9C2C-1934115AF31B}"/>
 </file>
 
 <file path=customXml/itemProps4.xml><?xml version="1.0" encoding="utf-8"?>
-<ds:datastoreItem xmlns:ds="http://schemas.openxmlformats.org/officeDocument/2006/customXml" ds:itemID="{9A0AC0FE-C26B-44D3-A523-884174406565}"/>
+<ds:datastoreItem xmlns:ds="http://schemas.openxmlformats.org/officeDocument/2006/customXml" ds:itemID="{98A65C2C-424F-4621-8C2E-EDF8B659A5E1}"/>
 </file>
</xml_diff>